<commit_message>
Add note on AI use to README
</commit_message>
<xml_diff>
--- a/Tick Design.docx
+++ b/Tick Design.docx
@@ -530,7 +530,6 @@
         <w:t>No two records have the same date, location and species.</w:t>
       </w:r>
     </w:p>
-    <w:p/>
     <w:p>
       <w:r>
         <w:t>Figure</w:t>
@@ -544,7 +543,6 @@
         <w:rPr>
           <w:noProof/>
         </w:rPr>
-        <w:lastRenderedPageBreak/>
         <w:drawing>
           <wp:inline distT="0" distB="0" distL="0" distR="0" wp14:anchorId="4AAED1B2" wp14:editId="6F424B70">
             <wp:extent cx="5721350" cy="2800350"/>
@@ -601,6 +599,7 @@
           <w:b/>
           <w:bCs/>
         </w:rPr>
+        <w:lastRenderedPageBreak/>
         <w:t>Testing the cleaning rules</w:t>
       </w:r>
       <w:r>
@@ -622,7 +621,7 @@
           <w:noProof/>
         </w:rPr>
         <w:drawing>
-          <wp:inline distT="0" distB="0" distL="0" distR="0" wp14:anchorId="30982109" wp14:editId="33C4DB21">
+          <wp:inline distT="0" distB="0" distL="0" distR="0" wp14:anchorId="30982109" wp14:editId="51E90880">
             <wp:extent cx="5721350" cy="3670300"/>
             <wp:effectExtent l="0" t="0" r="0" b="6350"/>
             <wp:docPr id="1387442389" name="Picture 3"/>
@@ -689,20 +688,17 @@
       </w:r>
       <w:proofErr w:type="spellEnd"/>
       <w:r>
-        <w:t xml:space="preserve"> to handle failures when calling Elanco’s API. If the request fails, or the response isn’t valid data, the error is caught and the function </w:t>
-      </w:r>
+        <w:t xml:space="preserve"> to handle failures when calling Elanco’s API. If the request fails, or the response isn’t valid data, the error is caught and the function tries again, waiting longer each time (5, 10, 20, then 40 seconds), instead of crashing the script. If Elanco’s API says I’ve sent too many requests, it waits a minute before trying again. After four failed attempts it gives up, logs what happened and stops cleanly, so nothing half-loaded ends up in the database.</w:t>
+      </w:r>
+    </w:p>
+    <w:p>
+      <w:r>
+        <w:t>To test this, I pointed it at a web page that doesn’t return data. The log in Figure 3 shows each retry with its growing delay, followed by “Giving up” and a clean stop.</w:t>
+      </w:r>
+    </w:p>
+    <w:p>
       <w:r>
         <w:lastRenderedPageBreak/>
-        <w:t>tries again, waiting longer each time (5, 10, 20, then 40 seconds), instead of crashing the script. If Elanco’s API says I’ve sent too many requests, it waits a minute before trying again. After four failed attempts it gives up, logs what happened and stops cleanly, so nothing half-loaded ends up in the database.</w:t>
-      </w:r>
-    </w:p>
-    <w:p>
-      <w:r>
-        <w:t>To test this, I pointed it at a web page that doesn’t return data. The log in Figure 3 shows each retry with its growing delay, followed by “Giving up” and a clean stop.</w:t>
-      </w:r>
-    </w:p>
-    <w:p>
-      <w:r>
         <w:t>Figure</w:t>
       </w:r>
       <w:r>
@@ -713,7 +709,7 @@
           <w:noProof/>
         </w:rPr>
         <w:drawing>
-          <wp:inline distT="0" distB="0" distL="0" distR="0" wp14:anchorId="26E4D38E" wp14:editId="14DE6B3E">
+          <wp:inline distT="0" distB="0" distL="0" distR="0" wp14:anchorId="26E4D38E" wp14:editId="10D18BB3">
             <wp:extent cx="5727700" cy="3733800"/>
             <wp:effectExtent l="0" t="0" r="6350" b="0"/>
             <wp:docPr id="1405941597" name="Picture 4"/>
@@ -775,7 +771,6 @@
         <w:rPr>
           <w:noProof/>
         </w:rPr>
-        <w:lastRenderedPageBreak/>
         <w:drawing>
           <wp:inline distT="0" distB="0" distL="0" distR="0" wp14:anchorId="52837CDD" wp14:editId="195A1836">
             <wp:extent cx="5728970" cy="4259580"/>
@@ -832,6 +827,7 @@
           <w:b/>
           <w:bCs/>
         </w:rPr>
+        <w:lastRenderedPageBreak/>
         <w:t>Loading the data</w:t>
       </w:r>
       <w:r>
@@ -913,7 +909,6 @@
     </w:p>
     <w:p>
       <w:r>
-        <w:lastRenderedPageBreak/>
         <w:t>app.py deals with web requests. It reads the query parameters, checks them (dates, limits and the allowed options), chooses the right function, and returns the result as JSON, or a clear error if something is wrong.</w:t>
       </w:r>
     </w:p>
@@ -960,6 +955,7 @@
     <w:p/>
     <w:p>
       <w:r>
+        <w:lastRenderedPageBreak/>
         <w:t>Figure</w:t>
       </w:r>
       <w:r>
@@ -1027,6 +1023,13 @@
       </w:r>
     </w:p>
     <w:p/>
+    <w:p/>
+    <w:p/>
+    <w:p/>
+    <w:p/>
+    <w:p/>
+    <w:p/>
+    <w:p/>
     <w:p>
       <w:r>
         <w:t xml:space="preserve"> </w:t>
@@ -1043,7 +1046,6 @@
         <w:rPr>
           <w:noProof/>
         </w:rPr>
-        <w:lastRenderedPageBreak/>
         <w:drawing>
           <wp:anchor distT="0" distB="0" distL="114300" distR="114300" simplePos="0" relativeHeight="251658240" behindDoc="0" locked="0" layoutInCell="1" allowOverlap="1" wp14:anchorId="3920AE3C" wp14:editId="27B1B547">
             <wp:simplePos x="914400" y="914400"/>
@@ -1106,11 +1108,28 @@
       </w:r>
     </w:p>
     <w:p>
-      <w:r>
+      <w:pPr>
         <w:rPr>
           <w:b/>
           <w:bCs/>
         </w:rPr>
+      </w:pPr>
+    </w:p>
+    <w:p>
+      <w:pPr>
+        <w:rPr>
+          <w:b/>
+          <w:bCs/>
+        </w:rPr>
+      </w:pPr>
+    </w:p>
+    <w:p>
+      <w:r>
+        <w:rPr>
+          <w:b/>
+          <w:bCs/>
+        </w:rPr>
+        <w:lastRenderedPageBreak/>
         <w:t>Design choices in db.py</w:t>
       </w:r>
     </w:p>
@@ -1173,15 +1192,23 @@
     </w:p>
     <w:p>
       <w:r>
+        <w:t>Seasonal average. The seasonal average divides by the number of years the data covers, so months with no sightings in some years count as zero.</w:t>
+      </w:r>
+    </w:p>
+    <w:p/>
+    <w:p/>
+    <w:p/>
+    <w:p/>
+    <w:p/>
+    <w:p/>
+    <w:p/>
+    <w:p/>
+    <w:p/>
+    <w:p/>
+    <w:p/>
+    <w:p>
+      <w:r>
         <w:lastRenderedPageBreak/>
-        <w:t>Seasonal average. The seasonal average divides by the number of years the data covers, so months with no sightings in some years count as zero.</w:t>
-      </w:r>
-    </w:p>
-    <w:p/>
-    <w:p/>
-    <w:p/>
-    <w:p>
-      <w:r>
         <w:t>Figure</w:t>
       </w:r>
       <w:r>
@@ -1249,7 +1276,6 @@
       </w:r>
     </w:p>
     <w:p/>
-    <w:p/>
     <w:p>
       <w:r>
         <w:t>Figure</w:t>
@@ -1263,7 +1289,6 @@
         <w:rPr>
           <w:noProof/>
         </w:rPr>
-        <w:lastRenderedPageBreak/>
         <w:drawing>
           <wp:inline distT="0" distB="0" distL="0" distR="0" wp14:anchorId="475C7BF6" wp14:editId="7F961876">
             <wp:extent cx="5720715" cy="2383790"/>
@@ -1319,7 +1344,132 @@
         <w:t>A direct MySQL query counting the sightings from 2020. It returns 69, matching the total in Figure 7.</w:t>
       </w:r>
     </w:p>
-    <w:p/>
+    <w:p>
+      <w:pPr>
+        <w:rPr>
+          <w:b/>
+          <w:bCs/>
+        </w:rPr>
+      </w:pPr>
+    </w:p>
+    <w:p>
+      <w:pPr>
+        <w:rPr>
+          <w:b/>
+          <w:bCs/>
+        </w:rPr>
+      </w:pPr>
+    </w:p>
+    <w:p>
+      <w:pPr>
+        <w:rPr>
+          <w:b/>
+          <w:bCs/>
+        </w:rPr>
+      </w:pPr>
+    </w:p>
+    <w:p>
+      <w:r>
+        <w:rPr>
+          <w:b/>
+          <w:bCs/>
+        </w:rPr>
+        <w:lastRenderedPageBreak/>
+        <w:t>Regions</w:t>
+      </w:r>
+    </w:p>
+    <w:p>
+      <w:r>
+        <w:t xml:space="preserve">The data only records cities, so I group them into UK regions using a fixed lookup in the code (for example, Manchester and Liverpool are both </w:t>
+      </w:r>
+      <w:proofErr w:type="gramStart"/>
+      <w:r>
+        <w:t>North West</w:t>
+      </w:r>
+      <w:proofErr w:type="gramEnd"/>
+      <w:r>
+        <w:t>). Scotland and Wales appear as their own areas. With more time I’d store this in a locations table with a region column, since region depends on location</w:t>
+      </w:r>
+      <w:r>
+        <w:t xml:space="preserve"> for example Figure 10: </w:t>
+      </w:r>
+    </w:p>
+    <w:p>
+      <w:r>
+        <w:rPr>
+          <w:noProof/>
+        </w:rPr>
+        <w:drawing>
+          <wp:inline distT="0" distB="0" distL="0" distR="0" wp14:anchorId="7F8531C5" wp14:editId="6B51503E">
+            <wp:extent cx="2893384" cy="3845491"/>
+            <wp:effectExtent l="0" t="0" r="2540" b="3175"/>
+            <wp:docPr id="180531219" name="Picture 1"/>
+            <wp:cNvGraphicFramePr>
+              <a:graphicFrameLocks xmlns:a="http://schemas.openxmlformats.org/drawingml/2006/main" noChangeAspect="1"/>
+            </wp:cNvGraphicFramePr>
+            <a:graphic xmlns:a="http://schemas.openxmlformats.org/drawingml/2006/main">
+              <a:graphicData uri="http://schemas.openxmlformats.org/drawingml/2006/picture">
+                <pic:pic xmlns:pic="http://schemas.openxmlformats.org/drawingml/2006/picture">
+                  <pic:nvPicPr>
+                    <pic:cNvPr id="0" name="Picture 1"/>
+                    <pic:cNvPicPr>
+                      <a:picLocks noChangeAspect="1" noChangeArrowheads="1"/>
+                    </pic:cNvPicPr>
+                  </pic:nvPicPr>
+                  <pic:blipFill rotWithShape="1">
+                    <a:blip r:embed="rId17">
+                      <a:extLst>
+                        <a:ext uri="{28A0092B-C50C-407E-A947-70E740481C1C}">
+                          <a14:useLocalDpi xmlns:a14="http://schemas.microsoft.com/office/drawing/2010/main" val="0"/>
+                        </a:ext>
+                      </a:extLst>
+                    </a:blip>
+                    <a:srcRect t="3930" b="6688"/>
+                    <a:stretch>
+                      <a:fillRect/>
+                    </a:stretch>
+                  </pic:blipFill>
+                  <pic:spPr bwMode="auto">
+                    <a:xfrm>
+                      <a:off x="0" y="0"/>
+                      <a:ext cx="2893695" cy="3845904"/>
+                    </a:xfrm>
+                    <a:prstGeom prst="rect">
+                      <a:avLst/>
+                    </a:prstGeom>
+                    <a:noFill/>
+                    <a:ln>
+                      <a:noFill/>
+                    </a:ln>
+                    <a:extLst>
+                      <a:ext uri="{53640926-AAD7-44D8-BBD7-CCE9431645EC}">
+                        <a14:shadowObscured xmlns:a14="http://schemas.microsoft.com/office/drawing/2010/main"/>
+                      </a:ext>
+                    </a:extLst>
+                  </pic:spPr>
+                </pic:pic>
+              </a:graphicData>
+            </a:graphic>
+          </wp:inline>
+        </w:drawing>
+      </w:r>
+      <w:r>
+        <w:t>/</w:t>
+      </w:r>
+      <w:proofErr w:type="spellStart"/>
+      <w:proofErr w:type="gramStart"/>
+      <w:r>
+        <w:t>summary</w:t>
+      </w:r>
+      <w:proofErr w:type="gramEnd"/>
+      <w:r>
+        <w:t>?group_by</w:t>
+      </w:r>
+      <w:proofErr w:type="spellEnd"/>
+      <w:r>
+        <w:t>=region, the sightings grouped into regions; the counts add up to 1000</w:t>
+      </w:r>
+    </w:p>
     <w:p/>
     <w:p>
       <w:r>
@@ -1400,6 +1550,7 @@
         </w:numPr>
       </w:pPr>
       <w:r>
+        <w:lastRenderedPageBreak/>
         <w:t xml:space="preserve">Scale. Cleaning is linear and fast, but at larger volumes. I’d load in batches and only </w:t>
       </w:r>
       <w:proofErr w:type="spellStart"/>
@@ -1444,7 +1595,6 @@
         </w:numPr>
       </w:pPr>
       <w:r>
-        <w:lastRenderedPageBreak/>
         <w:t>Keep rejected records. Store them in a separate table with the reason each was rejected, so nothing is silently dropped and the rejection counts can be audited. I choose to count them instead for the MVP.</w:t>
       </w:r>
     </w:p>
@@ -2500,7 +2650,6 @@
   <w:style w:type="character" w:default="1" w:styleId="DefaultParagraphFont">
     <w:name w:val="Default Paragraph Font"/>
     <w:uiPriority w:val="1"/>
-    <w:semiHidden/>
     <w:unhideWhenUsed/>
   </w:style>
   <w:style w:type="table" w:default="1" w:styleId="TableNormal">

</xml_diff>